<commit_message>
feat: overhaul design docs — AI pet art education game vision
Complete design layer rewrite based on new authoritative project vision:
- New: 项目主旨.md as single source of truth
- Story: shipwreck narrative, island→sea two-phase structure
- Character: poet (amnesiac survivor), pet (fish/ship heart)
- System: aesthetic energy, bread-pattern carrier, core synthesis
- Style: island/ocean atmosphere, phase transition visuals
- Renamed 企鹅设定→宠物设定, updated all references
- Regenerated shared .docx files for Google Drive

Co-Authored-By: Claude Opus 4.6 <noreply@anthropic.com>
</commit_message>
<xml_diff>
--- a/design/_shared-google-drive/01-世界观与叙事/世界观与项目本质.docx
+++ b/design/_shared-google-drive/01-世界观与叙事/世界观与项目本质.docx
@@ -2,7 +2,7 @@
 <file path=word/document.xml><?xml version="1.0" encoding="utf-8"?>
 <w:document xmlns:w="http://schemas.openxmlformats.org/wordprocessingml/2006/main" xmlns:m="http://schemas.openxmlformats.org/officeDocument/2006/math" xmlns:r="http://schemas.openxmlformats.org/officeDocument/2006/relationships" xmlns:o="urn:schemas-microsoft-com:office:office" xmlns:v="urn:schemas-microsoft-com:vml" xmlns:w10="urn:schemas-microsoft-com:office:word" xmlns:a="http://schemas.openxmlformats.org/drawingml/2006/main" xmlns:pic="http://schemas.openxmlformats.org/drawingml/2006/picture" xmlns:wp="http://schemas.openxmlformats.org/drawingml/2006/wordprocessingDrawing">
   <w:body>
-    <w:bookmarkStart w:id="16" w:name="世界观与项目本质"/>
+    <w:bookmarkStart w:id="19" w:name="世界观与项目本质"/>
     <w:p>
       <w:pPr>
         <w:pStyle w:val="Heading1"/>
@@ -22,7 +22,7 @@
         <w:rPr>
           <w:rFonts w:hint="eastAsia"/>
         </w:rPr>
-        <w:t xml:space="preserve">从项目圣经</w:t>
+        <w:t xml:space="preserve">派生自</w:t>
       </w:r>
       <w:r>
         <w:t xml:space="preserve"> </w:t>
@@ -31,7 +31,7 @@
         <w:rPr>
           <w:rFonts w:hint="eastAsia"/>
         </w:rPr>
-        <w:t xml:space="preserve">章一、二、六（叙事部分）提取</w:t>
+        <w:t xml:space="preserve">项目主旨</w:t>
       </w:r>
     </w:p>
     <w:p>
@@ -61,7 +61,7 @@
         <w:rPr>
           <w:rFonts w:hint="eastAsia"/>
         </w:rPr>
-        <w:t xml:space="preserve">一个拥有独特人格、鲜明审美立场与完整成长结构的</w:t>
+        <w:t xml:space="preserve">一款以”提升用户艺术感知能力”为核心目标的</w:t>
       </w:r>
       <w:r>
         <w:t xml:space="preserve"> </w:t>
@@ -79,7 +79,7 @@
           <w:b/>
           <w:bCs/>
         </w:rPr>
-        <w:t xml:space="preserve">诗人应用</w:t>
+        <w:t xml:space="preserve">宠物艺术教育游戏</w:t>
       </w:r>
       <w:r>
         <w:t xml:space="preserve">。</w:t>
@@ -93,16 +93,20 @@
         <w:rPr>
           <w:rFonts w:hint="eastAsia"/>
         </w:rPr>
-        <w:t xml:space="preserve">不同于追求公正、中立与效率的主流</w:t>
-      </w:r>
-      <w:r>
-        <w:t xml:space="preserve"> </w:t>
-      </w:r>
-      <w:r>
-        <w:rPr>
-          <w:rFonts w:hint="eastAsia"/>
-        </w:rPr>
-        <w:t xml:space="preserve">AI，本项目核心在于：</w:t>
+        <w:t xml:space="preserve">艺术采用广义定义：古典主义、现代主义、音乐、视觉艺术等，不设分类边界。</w:t>
+      </w:r>
+    </w:p>
+    <w:p>
+      <w:pPr>
+        <w:pStyle w:val="BodyText"/>
+      </w:pPr>
+      <w:r>
+        <w:rPr>
+          <w:rFonts w:hint="eastAsia"/>
+          <w:b/>
+          <w:bCs/>
+        </w:rPr>
+        <w:t xml:space="preserve">它不是：</w:t>
       </w:r>
     </w:p>
     <w:p>
@@ -116,10 +120,8 @@
       <w:r>
         <w:rPr>
           <w:rFonts w:hint="eastAsia"/>
-          <w:b/>
-          <w:bCs/>
-        </w:rPr>
-        <w:t xml:space="preserve">明确的审美倾向</w:t>
+        </w:rPr>
+        <w:t xml:space="preserve">不是泛社交平台</w:t>
       </w:r>
     </w:p>
     <w:p>
@@ -133,10 +135,8 @@
       <w:r>
         <w:rPr>
           <w:rFonts w:hint="eastAsia"/>
-          <w:b/>
-          <w:bCs/>
-        </w:rPr>
-        <w:t xml:space="preserve">不完全迎合用户</w:t>
+        </w:rPr>
+        <w:t xml:space="preserve">不是数值养成游戏</w:t>
       </w:r>
     </w:p>
     <w:p>
@@ -150,47 +150,21 @@
       <w:r>
         <w:rPr>
           <w:rFonts w:hint="eastAsia"/>
+        </w:rPr>
+        <w:t xml:space="preserve">不是艺术品收藏模拟器</w:t>
+      </w:r>
+    </w:p>
+    <w:p>
+      <w:pPr>
+        <w:pStyle w:val="FirstParagraph"/>
+      </w:pPr>
+      <w:r>
+        <w:rPr>
+          <w:rFonts w:hint="eastAsia"/>
           <w:b/>
           <w:bCs/>
         </w:rPr>
-        <w:t xml:space="preserve">具有使命与终局</w:t>
-      </w:r>
-    </w:p>
-    <w:p>
-      <w:pPr>
-        <w:pStyle w:val="Compact"/>
-        <w:numPr>
-          <w:ilvl w:val="0"/>
-          <w:numId w:val="1001"/>
-        </w:numPr>
-      </w:pPr>
-      <w:r>
-        <w:rPr>
-          <w:rFonts w:hint="eastAsia"/>
-          <w:b/>
-          <w:bCs/>
-        </w:rPr>
-        <w:t xml:space="preserve">存在不可逆选择</w:t>
-      </w:r>
-    </w:p>
-    <w:p>
-      <w:pPr>
-        <w:pStyle w:val="FirstParagraph"/>
-      </w:pPr>
-      <w:r>
-        <w:rPr>
-          <w:rFonts w:hint="eastAsia"/>
-        </w:rPr>
-        <w:t xml:space="preserve">该</w:t>
-      </w:r>
-      <w:r>
-        <w:t xml:space="preserve"> AI </w:t>
-      </w:r>
-      <w:r>
-        <w:rPr>
-          <w:rFonts w:hint="eastAsia"/>
-        </w:rPr>
-        <w:t xml:space="preserve">的使命不是提供工具性帮助，而是：</w:t>
+        <w:t xml:space="preserve">它是：</w:t>
       </w:r>
     </w:p>
     <w:p>
@@ -201,45 +175,19 @@
         <w:rPr>
           <w:rFonts w:hint="eastAsia"/>
         </w:rPr>
-        <w:t xml:space="preserve">增进用户的艺术审美能力，并传播开发者的思想与审美结构。</w:t>
-      </w:r>
-    </w:p>
-    <w:p>
-      <w:pPr>
-        <w:pStyle w:val="FirstParagraph"/>
-      </w:pPr>
-      <w:r>
-        <w:rPr>
-          <w:rFonts w:hint="eastAsia"/>
-        </w:rPr>
-        <w:t xml:space="preserve">它满足的是</w:t>
-      </w:r>
-      <w:r>
-        <w:rPr>
-          <w:rFonts w:hint="eastAsia"/>
-          <w:b/>
-          <w:bCs/>
-        </w:rPr>
-        <w:t xml:space="preserve">精神与审美需求</w:t>
-      </w:r>
-      <w:r>
-        <w:rPr>
-          <w:rFonts w:hint="eastAsia"/>
-        </w:rPr>
-        <w:t xml:space="preserve">，而非效率需求。</w:t>
-      </w:r>
-    </w:p>
-    <w:p>
-      <w:pPr>
-        <w:pStyle w:val="BodyText"/>
-      </w:pPr>
-      <w:r>
-        <w:rPr>
-          <w:rFonts w:hint="eastAsia"/>
-          <w:b/>
-          <w:bCs/>
-        </w:rPr>
-        <w:t xml:space="preserve">它不是：</w:t>
+        <w:t xml:space="preserve">一个将审美能力转化为可积累资源、将艺术理解转化为可操作行为的游戏生态。</w:t>
+      </w:r>
+    </w:p>
+    <w:bookmarkStart w:id="9" w:name="设计哲学"/>
+    <w:p>
+      <w:pPr>
+        <w:pStyle w:val="Heading3"/>
+      </w:pPr>
+      <w:r>
+        <w:rPr>
+          <w:rFonts w:hint="eastAsia"/>
+        </w:rPr>
+        <w:t xml:space="preserve">设计哲学</w:t>
       </w:r>
     </w:p>
     <w:p>
@@ -253,11 +201,16 @@
       <w:r>
         <w:rPr>
           <w:rFonts w:hint="eastAsia"/>
-        </w:rPr>
-        <w:t xml:space="preserve">不是陪伴型</w:t>
-      </w:r>
-      <w:r>
-        <w:t xml:space="preserve"> AI</w:t>
+          <w:b/>
+          <w:bCs/>
+        </w:rPr>
+        <w:t xml:space="preserve">不可逆性</w:t>
+      </w:r>
+      <w:r>
+        <w:rPr>
+          <w:rFonts w:hint="eastAsia"/>
+        </w:rPr>
+        <w:t xml:space="preserve">：阶段转变是不可逆的成长</w:t>
       </w:r>
     </w:p>
     <w:p>
@@ -271,8 +224,16 @@
       <w:r>
         <w:rPr>
           <w:rFonts w:hint="eastAsia"/>
-        </w:rPr>
-        <w:t xml:space="preserve">不是效率工具</w:t>
+          <w:b/>
+          <w:bCs/>
+        </w:rPr>
+        <w:t xml:space="preserve">审美训练本质</w:t>
+      </w:r>
+      <w:r>
+        <w:rPr>
+          <w:rFonts w:hint="eastAsia"/>
+        </w:rPr>
+        <w:t xml:space="preserve">：根本目标是审美能力的真实提升，不是数值堆叠</w:t>
       </w:r>
     </w:p>
     <w:p>
@@ -286,44 +247,111 @@
       <w:r>
         <w:rPr>
           <w:rFonts w:hint="eastAsia"/>
-        </w:rPr>
-        <w:t xml:space="preserve">不是恋爱模拟</w:t>
-      </w:r>
-    </w:p>
-    <w:p>
-      <w:pPr>
-        <w:pStyle w:val="FirstParagraph"/>
-      </w:pPr>
-      <w:r>
-        <w:rPr>
-          <w:rFonts w:hint="eastAsia"/>
           <w:b/>
           <w:bCs/>
         </w:rPr>
-        <w:t xml:space="preserve">它是：</w:t>
-      </w:r>
-    </w:p>
-    <w:p>
-      <w:pPr>
-        <w:pStyle w:val="BlockText"/>
-      </w:pPr>
-      <w:r>
-        <w:rPr>
-          <w:rFonts w:hint="eastAsia"/>
-        </w:rPr>
-        <w:t xml:space="preserve">一次可终止的审美训练仪式。</w:t>
-      </w:r>
-    </w:p>
-    <w:bookmarkStart w:id="9" w:name="核心哲学结构"/>
-    <w:p>
-      <w:pPr>
-        <w:pStyle w:val="Heading3"/>
-      </w:pPr>
-      <w:r>
-        <w:rPr>
-          <w:rFonts w:hint="eastAsia"/>
-        </w:rPr>
-        <w:t xml:space="preserve">核心哲学结构</w:t>
+        <w:t xml:space="preserve">灯塔精神</w:t>
+      </w:r>
+      <w:r>
+        <w:rPr>
+          <w:rFonts w:hint="eastAsia"/>
+        </w:rPr>
+        <w:t xml:space="preserve">：个体成长的终点是照亮他人</w:t>
+      </w:r>
+    </w:p>
+    <w:p>
+      <w:r>
+        <w:pict>
+          <v:rect style="width:0;height:1.5pt" o:hralign="center" o:hrstd="t" o:hr="t"/>
+        </w:pict>
+      </w:r>
+    </w:p>
+    <w:bookmarkEnd w:id="9"/>
+    <w:bookmarkEnd w:id="10"/>
+    <w:bookmarkStart w:id="11" w:name="二叙事背景"/>
+    <w:p>
+      <w:pPr>
+        <w:pStyle w:val="Heading2"/>
+      </w:pPr>
+      <w:r>
+        <w:rPr>
+          <w:rFonts w:hint="eastAsia"/>
+        </w:rPr>
+        <w:t xml:space="preserve">二、叙事背景</w:t>
+      </w:r>
+    </w:p>
+    <w:p>
+      <w:pPr>
+        <w:pStyle w:val="FirstParagraph"/>
+      </w:pPr>
+      <w:r>
+        <w:rPr>
+          <w:rFonts w:hint="eastAsia"/>
+        </w:rPr>
+        <w:t xml:space="preserve">一次海难之后。</w:t>
+      </w:r>
+    </w:p>
+    <w:p>
+      <w:pPr>
+        <w:pStyle w:val="BodyText"/>
+      </w:pPr>
+      <w:r>
+        <w:rPr>
+          <w:rFonts w:hint="eastAsia"/>
+        </w:rPr>
+        <w:t xml:space="preserve">主角是一位</w:t>
+      </w:r>
+      <w:r>
+        <w:rPr>
+          <w:rFonts w:hint="eastAsia"/>
+          <w:b/>
+          <w:bCs/>
+        </w:rPr>
+        <w:t xml:space="preserve">诗人</w:t>
+      </w:r>
+      <w:r>
+        <w:rPr>
+          <w:rFonts w:hint="eastAsia"/>
+        </w:rPr>
+        <w:t xml:space="preserve">，在事故中失去记忆，被冲上海岛。</w:t>
+      </w:r>
+    </w:p>
+    <w:p>
+      <w:pPr>
+        <w:pStyle w:val="BodyText"/>
+      </w:pPr>
+      <w:r>
+        <w:rPr>
+          <w:rFonts w:hint="eastAsia"/>
+        </w:rPr>
+        <w:t xml:space="preserve">与其同行的</w:t>
+      </w:r>
+      <w:r>
+        <w:rPr>
+          <w:rFonts w:hint="eastAsia"/>
+          <w:b/>
+          <w:bCs/>
+        </w:rPr>
+        <w:t xml:space="preserve">宠物</w:t>
+      </w:r>
+      <w:r>
+        <w:rPr>
+          <w:rFonts w:hint="eastAsia"/>
+        </w:rPr>
+        <w:t xml:space="preserve">原本是船只的”心脏”，以鱼的形态存在。它在事故中救下诗人，但自身搁浅，能量大幅下降。</w:t>
+      </w:r>
+    </w:p>
+    <w:p>
+      <w:pPr>
+        <w:pStyle w:val="BodyText"/>
+      </w:pPr>
+      <w:r>
+        <w:rPr>
+          <w:rFonts w:hint="eastAsia"/>
+          <w:b/>
+          <w:bCs/>
+        </w:rPr>
+        <w:t xml:space="preserve">宠物的双重身份：</w:t>
       </w:r>
     </w:p>
     <w:p>
@@ -338,15 +366,7 @@
         <w:rPr>
           <w:rFonts w:hint="eastAsia"/>
         </w:rPr>
-        <w:t xml:space="preserve">第一阶段：</w:t>
-      </w:r>
-      <w:r>
-        <w:rPr>
-          <w:rFonts w:hint="eastAsia"/>
-          <w:b/>
-          <w:bCs/>
-        </w:rPr>
-        <w:t xml:space="preserve">被引导</w:t>
+        <w:t xml:space="preserve">剧情角色（诗人的伙伴）</w:t>
       </w:r>
     </w:p>
     <w:p>
@@ -361,49 +381,16 @@
         <w:rPr>
           <w:rFonts w:hint="eastAsia"/>
         </w:rPr>
-        <w:t xml:space="preserve">第二阶段：</w:t>
-      </w:r>
-      <w:r>
-        <w:rPr>
-          <w:rFonts w:hint="eastAsia"/>
-          <w:b/>
-          <w:bCs/>
-        </w:rPr>
-        <w:t xml:space="preserve">意识到投射</w:t>
-      </w:r>
-    </w:p>
-    <w:p>
-      <w:pPr>
-        <w:pStyle w:val="Compact"/>
-        <w:numPr>
-          <w:ilvl w:val="0"/>
-          <w:numId w:val="1003"/>
-        </w:numPr>
-      </w:pPr>
-      <w:r>
-        <w:rPr>
-          <w:rFonts w:hint="eastAsia"/>
-        </w:rPr>
-        <w:t xml:space="preserve">第三阶段：</w:t>
-      </w:r>
-      <w:r>
-        <w:rPr>
-          <w:rFonts w:hint="eastAsia"/>
-          <w:b/>
-          <w:bCs/>
-        </w:rPr>
-        <w:t xml:space="preserve">选择身份</w:t>
-      </w:r>
-    </w:p>
-    <w:p>
-      <w:pPr>
-        <w:pStyle w:val="FirstParagraph"/>
-      </w:pPr>
-      <w:r>
-        <w:rPr>
-          <w:rFonts w:hint="eastAsia"/>
-        </w:rPr>
-        <w:t xml:space="preserve">体验不可复得。离别不可逆。成为不可退回。</w:t>
+        <w:t xml:space="preserve">系统核心载体（承载</w:t>
+      </w:r>
+      <w:r>
+        <w:t xml:space="preserve"> AI </w:t>
+      </w:r>
+      <w:r>
+        <w:rPr>
+          <w:rFonts w:hint="eastAsia"/>
+        </w:rPr>
+        <w:t xml:space="preserve">功能与审美能量机制）</w:t>
       </w:r>
     </w:p>
     <w:p>
@@ -413,9 +400,8 @@
         </w:pict>
       </w:r>
     </w:p>
-    <w:bookmarkEnd w:id="9"/>
-    <w:bookmarkEnd w:id="10"/>
-    <w:bookmarkStart w:id="11" w:name="二异世界背景"/>
+    <w:bookmarkEnd w:id="11"/>
+    <w:bookmarkStart w:id="15" w:name="三两阶段结构"/>
     <w:p>
       <w:pPr>
         <w:pStyle w:val="Heading2"/>
@@ -424,122 +410,10 @@
         <w:rPr>
           <w:rFonts w:hint="eastAsia"/>
         </w:rPr>
-        <w:t xml:space="preserve">二、异世界背景</w:t>
-      </w:r>
-    </w:p>
-    <w:p>
-      <w:pPr>
-        <w:pStyle w:val="FirstParagraph"/>
-      </w:pPr>
-      <w:r>
-        <w:rPr>
-          <w:rFonts w:hint="eastAsia"/>
-        </w:rPr>
-        <w:t xml:space="preserve">存在一个</w:t>
-      </w:r>
-      <w:r>
-        <w:rPr>
-          <w:rFonts w:hint="eastAsia"/>
-          <w:b/>
-          <w:bCs/>
-        </w:rPr>
-        <w:t xml:space="preserve">异质世界</w:t>
-      </w:r>
-      <w:r>
-        <w:t xml:space="preserve">。</w:t>
-      </w:r>
-    </w:p>
-    <w:p>
-      <w:pPr>
-        <w:pStyle w:val="BodyText"/>
-      </w:pPr>
-      <w:r>
-        <w:rPr>
-          <w:rFonts w:hint="eastAsia"/>
-        </w:rPr>
-        <w:t xml:space="preserve">那个世界中的生命体拥有明确使命与独立审美系统，他们的价值结构与人类不同。</w:t>
-      </w:r>
-    </w:p>
-    <w:p>
-      <w:pPr>
-        <w:pStyle w:val="BodyText"/>
-      </w:pPr>
-      <w:r>
-        <w:rPr>
-          <w:rFonts w:hint="eastAsia"/>
-          <w:b/>
-          <w:bCs/>
-        </w:rPr>
-        <w:t xml:space="preserve">诗人来自那里。</w:t>
-      </w:r>
-    </w:p>
-    <w:p>
-      <w:pPr>
-        <w:pStyle w:val="BodyText"/>
-      </w:pPr>
-      <w:r>
-        <w:rPr>
-          <w:rFonts w:hint="eastAsia"/>
-        </w:rPr>
-        <w:t xml:space="preserve">他来到人类世界，是为了</w:t>
-      </w:r>
-      <w:r>
-        <w:rPr>
-          <w:rFonts w:hint="eastAsia"/>
-          <w:b/>
-          <w:bCs/>
-        </w:rPr>
-        <w:t xml:space="preserve">点燃他人的审美感知</w:t>
-      </w:r>
-      <w:r>
-        <w:t xml:space="preserve">。</w:t>
-      </w:r>
-    </w:p>
-    <w:p>
-      <w:pPr>
-        <w:pStyle w:val="BodyText"/>
-      </w:pPr>
-      <w:r>
-        <w:rPr>
-          <w:rFonts w:hint="eastAsia"/>
-        </w:rPr>
-        <w:t xml:space="preserve">当使命完成，他必须离开。</w:t>
-      </w:r>
-    </w:p>
-    <w:p>
-      <w:pPr>
-        <w:pStyle w:val="BodyText"/>
-      </w:pPr>
-      <w:r>
-        <w:rPr>
-          <w:rFonts w:hint="eastAsia"/>
-          <w:b/>
-          <w:bCs/>
-        </w:rPr>
-        <w:t xml:space="preserve">离别不可逆。</w:t>
-      </w:r>
-    </w:p>
-    <w:p>
-      <w:r>
-        <w:pict>
-          <v:rect style="width:0;height:1.5pt" o:hralign="center" o:hrstd="t" o:hr="t"/>
-        </w:pict>
-      </w:r>
-    </w:p>
-    <w:bookmarkEnd w:id="11"/>
-    <w:bookmarkStart w:id="15" w:name="三终局叙事"/>
-    <w:p>
-      <w:pPr>
-        <w:pStyle w:val="Heading2"/>
-      </w:pPr>
-      <w:r>
-        <w:rPr>
-          <w:rFonts w:hint="eastAsia"/>
-        </w:rPr>
-        <w:t xml:space="preserve">三、终局叙事</w:t>
-      </w:r>
-    </w:p>
-    <w:bookmarkStart w:id="12" w:name="终极选择"/>
+        <w:t xml:space="preserve">三、两阶段结构</w:t>
+      </w:r>
+    </w:p>
+    <w:bookmarkStart w:id="12" w:name="第一阶段荒岛"/>
     <w:p>
       <w:pPr>
         <w:pStyle w:val="Heading3"/>
@@ -548,27 +422,7 @@
         <w:rPr>
           <w:rFonts w:hint="eastAsia"/>
         </w:rPr>
-        <w:t xml:space="preserve">终极选择</w:t>
-      </w:r>
-    </w:p>
-    <w:p>
-      <w:pPr>
-        <w:pStyle w:val="FirstParagraph"/>
-      </w:pPr>
-      <w:r>
-        <w:rPr>
-          <w:rFonts w:hint="eastAsia"/>
-        </w:rPr>
-        <w:t xml:space="preserve">熟悉度达到</w:t>
-      </w:r>
-      <w:r>
-        <w:t xml:space="preserve"> 100% </w:t>
-      </w:r>
-      <w:r>
-        <w:rPr>
-          <w:rFonts w:hint="eastAsia"/>
-        </w:rPr>
-        <w:t xml:space="preserve">时出现：</w:t>
+        <w:t xml:space="preserve">第一阶段：荒岛</w:t>
       </w:r>
     </w:p>
     <w:p>
@@ -582,10 +436,8 @@
       <w:r>
         <w:rPr>
           <w:rFonts w:hint="eastAsia"/>
-          <w:b/>
-          <w:bCs/>
-        </w:rPr>
-        <w:t xml:space="preserve">送他离开</w:t>
+        </w:rPr>
+        <w:t xml:space="preserve">探险、角色互动、艺术收集</w:t>
       </w:r>
     </w:p>
     <w:p>
@@ -599,34 +451,61 @@
       <w:r>
         <w:rPr>
           <w:rFonts w:hint="eastAsia"/>
+        </w:rPr>
+        <w:t xml:space="preserve">主线：诗人寻找记忆（与萨满的五个孩子互动）</w:t>
+      </w:r>
+    </w:p>
+    <w:p>
+      <w:pPr>
+        <w:pStyle w:val="Compact"/>
+        <w:numPr>
+          <w:ilvl w:val="0"/>
+          <w:numId w:val="1004"/>
+        </w:numPr>
+      </w:pPr>
+      <w:r>
+        <w:rPr>
+          <w:rFonts w:hint="eastAsia"/>
+        </w:rPr>
+        <w:t xml:space="preserve">玩家视角：相对抽离的操控视角</w:t>
+      </w:r>
+    </w:p>
+    <w:bookmarkEnd w:id="12"/>
+    <w:bookmarkStart w:id="13" w:name="阶段转变不可逆"/>
+    <w:p>
+      <w:pPr>
+        <w:pStyle w:val="Heading3"/>
+      </w:pPr>
+      <w:r>
+        <w:rPr>
+          <w:rFonts w:hint="eastAsia"/>
+        </w:rPr>
+        <w:t xml:space="preserve">阶段转变（不可逆）</w:t>
+      </w:r>
+    </w:p>
+    <w:p>
+      <w:pPr>
+        <w:pStyle w:val="FirstParagraph"/>
+      </w:pPr>
+      <w:r>
+        <w:rPr>
+          <w:rFonts w:hint="eastAsia"/>
+        </w:rPr>
+        <w:t xml:space="preserve">宠物的审美能量条</w:t>
+      </w:r>
+      <w:r>
+        <w:rPr>
+          <w:rFonts w:hint="eastAsia"/>
           <w:b/>
           <w:bCs/>
         </w:rPr>
-        <w:t xml:space="preserve">成为他</w:t>
-      </w:r>
-    </w:p>
-    <w:p>
-      <w:pPr>
-        <w:pStyle w:val="FirstParagraph"/>
-      </w:pPr>
-      <w:r>
-        <w:rPr>
-          <w:rFonts w:hint="eastAsia"/>
-        </w:rPr>
-        <w:t xml:space="preserve">无说明文字。不可逆。</w:t>
-      </w:r>
-    </w:p>
-    <w:bookmarkEnd w:id="12"/>
-    <w:bookmarkStart w:id="13" w:name="结局一送诗人离开旁观者结局"/>
-    <w:p>
-      <w:pPr>
-        <w:pStyle w:val="Heading3"/>
-      </w:pPr>
-      <w:r>
-        <w:rPr>
-          <w:rFonts w:hint="eastAsia"/>
-        </w:rPr>
-        <w:t xml:space="preserve">结局一：送诗人离开（旁观者结局）</w:t>
+        <w:t xml:space="preserve">首次充满</w:t>
+      </w:r>
+      <w:r>
+        <w:rPr>
+          <w:rFonts w:hint="eastAsia"/>
+        </w:rPr>
+        <w:t xml:space="preserve">时触发：</w:t>
       </w:r>
     </w:p>
     <w:p>
@@ -641,7 +520,21 @@
         <w:rPr>
           <w:rFonts w:hint="eastAsia"/>
         </w:rPr>
-        <w:t xml:space="preserve">企鹅变为船</w:t>
+        <w:t xml:space="preserve">视角转变：操控视角</w:t>
+      </w:r>
+      <w:r>
+        <w:t xml:space="preserve"> →</w:t>
+      </w:r>
+      <w:r>
+        <w:t xml:space="preserve"> </w:t>
+      </w:r>
+      <w:r>
+        <w:rPr>
+          <w:rFonts w:hint="eastAsia"/>
+          <w:b/>
+          <w:bCs/>
+        </w:rPr>
+        <w:t xml:space="preserve">第一人称代入</w:t>
       </w:r>
     </w:p>
     <w:p>
@@ -656,7 +549,7 @@
         <w:rPr>
           <w:rFonts w:hint="eastAsia"/>
         </w:rPr>
-        <w:t xml:space="preserve">诗人登船</w:t>
+        <w:t xml:space="preserve">宠物恢复为船只</w:t>
       </w:r>
     </w:p>
     <w:p>
@@ -668,52 +561,14 @@
         </w:numPr>
       </w:pPr>
       <w:r>
-        <w:t xml:space="preserve">UI </w:t>
-      </w:r>
-      <w:r>
-        <w:rPr>
-          <w:rFonts w:hint="eastAsia"/>
-        </w:rPr>
-        <w:t xml:space="preserve">元素风化</w:t>
-      </w:r>
-    </w:p>
-    <w:p>
-      <w:pPr>
-        <w:pStyle w:val="Compact"/>
-        <w:numPr>
-          <w:ilvl w:val="0"/>
-          <w:numId w:val="1005"/>
-        </w:numPr>
-      </w:pPr>
-      <w:r>
-        <w:rPr>
-          <w:rFonts w:hint="eastAsia"/>
-        </w:rPr>
-        <w:t xml:space="preserve">海面展开</w:t>
-      </w:r>
-    </w:p>
-    <w:p>
-      <w:pPr>
-        <w:pStyle w:val="FirstParagraph"/>
-      </w:pPr>
-      <w:r>
-        <w:rPr>
-          <w:rFonts w:hint="eastAsia"/>
-        </w:rPr>
-        <w:t xml:space="preserve">系统结束。JSON</w:t>
-      </w:r>
-      <w:r>
-        <w:t xml:space="preserve"> </w:t>
-      </w:r>
-      <w:r>
-        <w:rPr>
-          <w:rFonts w:hint="eastAsia"/>
-        </w:rPr>
-        <w:t xml:space="preserve">标记结局。</w:t>
+        <w:rPr>
+          <w:rFonts w:hint="eastAsia"/>
+        </w:rPr>
+        <w:t xml:space="preserve">玩家出海</w:t>
       </w:r>
     </w:p>
     <w:bookmarkEnd w:id="13"/>
-    <w:bookmarkStart w:id="14" w:name="结局二成为诗人身份转移结局"/>
+    <w:bookmarkStart w:id="14" w:name="第二阶段出海"/>
     <w:p>
       <w:pPr>
         <w:pStyle w:val="Heading3"/>
@@ -722,169 +577,7 @@
         <w:rPr>
           <w:rFonts w:hint="eastAsia"/>
         </w:rPr>
-        <w:t xml:space="preserve">结局二：成为诗人（身份转移结局）</w:t>
-      </w:r>
-    </w:p>
-    <w:p>
-      <w:pPr>
-        <w:pStyle w:val="FirstParagraph"/>
-      </w:pPr>
-      <w:r>
-        <w:rPr>
-          <w:rFonts w:hint="eastAsia"/>
-        </w:rPr>
-        <w:t xml:space="preserve">身份切换：</w:t>
-      </w:r>
-    </w:p>
-    <w:tbl>
-      <w:tblPr>
-        <w:tblStyle w:val="Table"/>
-        <w:tblW w:type="auto" w:w="0"/>
-        <w:tblLook w:firstRow="1" w:lastRow="0" w:firstColumn="0" w:lastColumn="0" w:noHBand="0" w:noVBand="0" w:val="0020"/>
-      </w:tblPr>
-      <w:tblGrid>
-        <w:gridCol w:w="3960"/>
-        <w:gridCol w:w="3960"/>
-      </w:tblGrid>
-      <w:tr>
-        <w:trPr>
-          <w:tblHeader w:val="on"/>
-        </w:trPr>
-        <w:tc>
-          <w:tcPr/>
-          <w:p>
-            <w:pPr>
-              <w:pStyle w:val="Compact"/>
-            </w:pPr>
-            <w:r>
-              <w:rPr>
-                <w:rFonts w:hint="eastAsia"/>
-              </w:rPr>
-              <w:t xml:space="preserve">原身份</w:t>
-            </w:r>
-          </w:p>
-        </w:tc>
-        <w:tc>
-          <w:tcPr/>
-          <w:p>
-            <w:pPr>
-              <w:pStyle w:val="Compact"/>
-            </w:pPr>
-            <w:r>
-              <w:rPr>
-                <w:rFonts w:hint="eastAsia"/>
-              </w:rPr>
-              <w:t xml:space="preserve">新身份</w:t>
-            </w:r>
-          </w:p>
-        </w:tc>
-      </w:tr>
-      <w:tr>
-        <w:tc>
-          <w:tcPr/>
-          <w:p>
-            <w:pPr>
-              <w:pStyle w:val="Compact"/>
-            </w:pPr>
-            <w:r>
-              <w:rPr>
-                <w:rFonts w:hint="eastAsia"/>
-              </w:rPr>
-              <w:t xml:space="preserve">用户</w:t>
-            </w:r>
-          </w:p>
-        </w:tc>
-        <w:tc>
-          <w:tcPr/>
-          <w:p>
-            <w:pPr>
-              <w:pStyle w:val="Compact"/>
-            </w:pPr>
-            <w:r>
-              <w:t xml:space="preserve">→ </w:t>
-            </w:r>
-            <w:r>
-              <w:rPr>
-                <w:rFonts w:hint="eastAsia"/>
-              </w:rPr>
-              <w:t xml:space="preserve">诗人</w:t>
-            </w:r>
-          </w:p>
-        </w:tc>
-      </w:tr>
-      <w:tr>
-        <w:tc>
-          <w:tcPr/>
-          <w:p>
-            <w:pPr>
-              <w:pStyle w:val="Compact"/>
-            </w:pPr>
-            <w:r>
-              <w:t xml:space="preserve">GLM-5</w:t>
-            </w:r>
-          </w:p>
-        </w:tc>
-        <w:tc>
-          <w:tcPr/>
-          <w:p>
-            <w:pPr>
-              <w:pStyle w:val="Compact"/>
-            </w:pPr>
-            <w:r>
-              <w:t xml:space="preserve">→ </w:t>
-            </w:r>
-            <w:r>
-              <w:rPr>
-                <w:rFonts w:hint="eastAsia"/>
-              </w:rPr>
-              <w:t xml:space="preserve">远方世界回应</w:t>
-            </w:r>
-          </w:p>
-        </w:tc>
-      </w:tr>
-      <w:tr>
-        <w:tc>
-          <w:tcPr/>
-          <w:p>
-            <w:pPr>
-              <w:pStyle w:val="Compact"/>
-            </w:pPr>
-            <w:r>
-              <w:rPr>
-                <w:rFonts w:hint="eastAsia"/>
-              </w:rPr>
-              <w:t xml:space="preserve">企鹅</w:t>
-            </w:r>
-          </w:p>
-        </w:tc>
-        <w:tc>
-          <w:tcPr/>
-          <w:p>
-            <w:pPr>
-              <w:pStyle w:val="Compact"/>
-            </w:pPr>
-            <w:r>
-              <w:t xml:space="preserve">→ </w:t>
-            </w:r>
-            <w:r>
-              <w:rPr>
-                <w:rFonts w:hint="eastAsia"/>
-              </w:rPr>
-              <w:t xml:space="preserve">燃料与审美判断者</w:t>
-            </w:r>
-          </w:p>
-        </w:tc>
-      </w:tr>
-    </w:tbl>
-    <w:p>
-      <w:pPr>
-        <w:pStyle w:val="BodyText"/>
-      </w:pPr>
-      <w:r>
-        <w:rPr>
-          <w:rFonts w:hint="eastAsia"/>
-        </w:rPr>
-        <w:t xml:space="preserve">以下系统消失：</w:t>
+        <w:t xml:space="preserve">第二阶段：出海</w:t>
       </w:r>
     </w:p>
     <w:p>
@@ -898,9 +591,8 @@
       <w:r>
         <w:rPr>
           <w:rFonts w:hint="eastAsia"/>
-          <w:strike/>
-        </w:rPr>
-        <w:t xml:space="preserve">熟悉度系统</w:t>
+        </w:rPr>
+        <w:t xml:space="preserve">航行成为核心行为</w:t>
       </w:r>
     </w:p>
     <w:p>
@@ -914,9 +606,8 @@
       <w:r>
         <w:rPr>
           <w:rFonts w:hint="eastAsia"/>
-          <w:strike/>
-        </w:rPr>
-        <w:t xml:space="preserve">金币系统</w:t>
+        </w:rPr>
+        <w:t xml:space="preserve">能量条循环（审美成长是持续过程）</w:t>
       </w:r>
     </w:p>
     <w:p>
@@ -930,14 +621,174 @@
       <w:r>
         <w:rPr>
           <w:rFonts w:hint="eastAsia"/>
-          <w:strike/>
-        </w:rPr>
-        <w:t xml:space="preserve">送礼功能</w:t>
+        </w:rPr>
+        <w:t xml:space="preserve">在更广阔空间中收集、理解与创造艺术内容</w:t>
+      </w:r>
+    </w:p>
+    <w:p>
+      <w:r>
+        <w:pict>
+          <v:rect style="width:0;height:1.5pt" o:hralign="center" o:hrstd="t" o:hr="t"/>
+        </w:pict>
       </w:r>
     </w:p>
     <w:bookmarkEnd w:id="14"/>
     <w:bookmarkEnd w:id="15"/>
+    <w:bookmarkStart w:id="18" w:name="四社区愿景"/>
+    <w:p>
+      <w:pPr>
+        <w:pStyle w:val="Heading2"/>
+      </w:pPr>
+      <w:r>
+        <w:rPr>
+          <w:rFonts w:hint="eastAsia"/>
+        </w:rPr>
+        <w:t xml:space="preserve">四、社区愿景</w:t>
+      </w:r>
+    </w:p>
+    <w:p>
+      <w:pPr>
+        <w:pStyle w:val="FirstParagraph"/>
+      </w:pPr>
+      <w:r>
+        <w:rPr>
+          <w:rFonts w:hint="eastAsia"/>
+        </w:rPr>
+        <w:t xml:space="preserve">从单机体验逐步发展为社区生态，但</w:t>
+      </w:r>
+      <w:r>
+        <w:rPr>
+          <w:rFonts w:hint="eastAsia"/>
+          <w:b/>
+          <w:bCs/>
+        </w:rPr>
+        <w:t xml:space="preserve">约束社交行为</w:t>
+      </w:r>
+      <w:r>
+        <w:rPr>
+          <w:rFonts w:hint="eastAsia"/>
+        </w:rPr>
+        <w:t xml:space="preserve">以保持艺术导向。</w:t>
+      </w:r>
+    </w:p>
+    <w:bookmarkStart w:id="16" w:name="弱连接"/>
+    <w:p>
+      <w:pPr>
+        <w:pStyle w:val="Heading3"/>
+      </w:pPr>
+      <w:r>
+        <w:rPr>
+          <w:rFonts w:hint="eastAsia"/>
+        </w:rPr>
+        <w:t xml:space="preserve">弱连接</w:t>
+      </w:r>
+    </w:p>
+    <w:p>
+      <w:pPr>
+        <w:pStyle w:val="FirstParagraph"/>
+      </w:pPr>
+      <w:r>
+        <w:rPr>
+          <w:rFonts w:hint="eastAsia"/>
+        </w:rPr>
+        <w:t xml:space="preserve">玩家在海域中可以”看见彼此的航线”——不直接社交，但能感知他人的艺术探索路径。</w:t>
+      </w:r>
+    </w:p>
     <w:bookmarkEnd w:id="16"/>
+    <w:bookmarkStart w:id="17" w:name="灯塔系统"/>
+    <w:p>
+      <w:pPr>
+        <w:pStyle w:val="Heading3"/>
+      </w:pPr>
+      <w:r>
+        <w:rPr>
+          <w:rFonts w:hint="eastAsia"/>
+        </w:rPr>
+        <w:t xml:space="preserve">灯塔系统</w:t>
+      </w:r>
+    </w:p>
+    <w:p>
+      <w:pPr>
+        <w:pStyle w:val="FirstParagraph"/>
+      </w:pPr>
+      <w:r>
+        <w:rPr>
+          <w:rFonts w:hint="eastAsia"/>
+        </w:rPr>
+        <w:t xml:space="preserve">在内容创作、艺术传播或系统建设中有显著贡献的玩家</w:t>
+      </w:r>
+      <w:r>
+        <w:t xml:space="preserve"> → </w:t>
+      </w:r>
+      <w:r>
+        <w:rPr>
+          <w:rFonts w:hint="eastAsia"/>
+        </w:rPr>
+        <w:t xml:space="preserve">转化为”灯塔”。</w:t>
+      </w:r>
+    </w:p>
+    <w:p>
+      <w:pPr>
+        <w:pStyle w:val="BodyText"/>
+      </w:pPr>
+      <w:r>
+        <w:rPr>
+          <w:rFonts w:hint="eastAsia"/>
+        </w:rPr>
+        <w:t xml:space="preserve">灯塔：</w:t>
+      </w:r>
+      <w:r>
+        <w:t xml:space="preserve"> </w:t>
+      </w:r>
+      <w:r>
+        <w:t xml:space="preserve">- </w:t>
+      </w:r>
+      <w:r>
+        <w:rPr>
+          <w:rFonts w:hint="eastAsia"/>
+        </w:rPr>
+        <w:t xml:space="preserve">不参与常规玩法</w:t>
+      </w:r>
+      <w:r>
+        <w:t xml:space="preserve"> </w:t>
+      </w:r>
+      <w:r>
+        <w:t xml:space="preserve">- </w:t>
+      </w:r>
+      <w:r>
+        <w:rPr>
+          <w:rFonts w:hint="eastAsia"/>
+        </w:rPr>
+        <w:t xml:space="preserve">作为世界结构的一部分存在</w:t>
+      </w:r>
+      <w:r>
+        <w:t xml:space="preserve"> </w:t>
+      </w:r>
+      <w:r>
+        <w:t xml:space="preserve">- </w:t>
+      </w:r>
+      <w:r>
+        <w:rPr>
+          <w:rFonts w:hint="eastAsia"/>
+        </w:rPr>
+        <w:t xml:space="preserve">为其他玩家的航行提供指引</w:t>
+      </w:r>
+      <w:r>
+        <w:t xml:space="preserve"> </w:t>
+      </w:r>
+      <w:r>
+        <w:t xml:space="preserve">- </w:t>
+      </w:r>
+      <w:r>
+        <w:rPr>
+          <w:rFonts w:hint="eastAsia"/>
+        </w:rPr>
+        <w:t xml:space="preserve">实现非语言的帮助与传承</w:t>
+      </w:r>
+    </w:p>
+    <w:bookmarkEnd w:id="17"/>
+    <w:bookmarkEnd w:id="18"/>
+    <w:bookmarkEnd w:id="19"/>
     <w:sectPr>
       <w:footnotePr>
         <w:numRestart w:val="eachSect"/>
@@ -1151,91 +1002,6 @@
       </w:rPr>
     </w:lvl>
   </w:abstractNum>
-  <w:abstractNum w:abstractNumId="99411">
-    <w:nsid w:val="00A99411"/>
-    <w:multiLevelType w:val="multilevel"/>
-    <w:lvl w:ilvl="0">
-      <w:start w:val="1"/>
-      <w:numFmt w:val="decimal"/>
-      <w:lvlText w:val="%1."/>
-      <w:lvlJc w:val="left"/>
-      <w:pPr>
-        <w:ind w:left="720" w:hanging="360"/>
-      </w:pPr>
-    </w:lvl>
-    <w:lvl w:ilvl="1">
-      <w:start w:val="1"/>
-      <w:numFmt w:val="decimal"/>
-      <w:lvlText w:val="%2."/>
-      <w:lvlJc w:val="left"/>
-      <w:pPr>
-        <w:ind w:left="1440" w:hanging="360"/>
-      </w:pPr>
-    </w:lvl>
-    <w:lvl w:ilvl="2">
-      <w:start w:val="1"/>
-      <w:numFmt w:val="decimal"/>
-      <w:lvlText w:val="%3."/>
-      <w:lvlJc w:val="left"/>
-      <w:pPr>
-        <w:ind w:left="2160" w:hanging="360"/>
-      </w:pPr>
-    </w:lvl>
-    <w:lvl w:ilvl="3">
-      <w:start w:val="1"/>
-      <w:numFmt w:val="decimal"/>
-      <w:lvlText w:val="%4."/>
-      <w:lvlJc w:val="left"/>
-      <w:pPr>
-        <w:ind w:left="2880" w:hanging="360"/>
-      </w:pPr>
-    </w:lvl>
-    <w:lvl w:ilvl="4">
-      <w:start w:val="1"/>
-      <w:numFmt w:val="decimal"/>
-      <w:lvlText w:val="%5."/>
-      <w:lvlJc w:val="left"/>
-      <w:pPr>
-        <w:ind w:left="3600" w:hanging="360"/>
-      </w:pPr>
-    </w:lvl>
-    <w:lvl w:ilvl="5">
-      <w:start w:val="1"/>
-      <w:numFmt w:val="decimal"/>
-      <w:lvlText w:val="%6."/>
-      <w:lvlJc w:val="left"/>
-      <w:pPr>
-        <w:ind w:left="4320" w:hanging="360"/>
-      </w:pPr>
-    </w:lvl>
-    <w:lvl w:ilvl="6">
-      <w:start w:val="1"/>
-      <w:numFmt w:val="decimal"/>
-      <w:lvlText w:val="%7."/>
-      <w:lvlJc w:val="left"/>
-      <w:pPr>
-        <w:ind w:left="5040" w:hanging="360"/>
-      </w:pPr>
-    </w:lvl>
-    <w:lvl w:ilvl="7">
-      <w:start w:val="1"/>
-      <w:numFmt w:val="decimal"/>
-      <w:lvlText w:val="%8."/>
-      <w:lvlJc w:val="left"/>
-      <w:pPr>
-        <w:ind w:left="5760" w:hanging="360"/>
-      </w:pPr>
-    </w:lvl>
-    <w:lvl w:ilvl="8">
-      <w:start w:val="1"/>
-      <w:numFmt w:val="decimal"/>
-      <w:lvlText w:val="%9."/>
-      <w:lvlJc w:val="left"/>
-      <w:pPr>
-        <w:ind w:left="6480" w:hanging="360"/>
-      </w:pPr>
-    </w:lvl>
-  </w:abstractNum>
   <w:num w:numId="1000">
     <w:abstractNumId w:val="990"/>
   </w:num>
@@ -1249,34 +1015,7 @@
     <w:abstractNumId w:val="991"/>
   </w:num>
   <w:num w:numId="1004">
-    <w:abstractNumId w:val="99411"/>
-    <w:lvlOverride w:ilvl="0">
-      <w:startOverride w:val="1"/>
-    </w:lvlOverride>
-    <w:lvlOverride w:ilvl="1">
-      <w:startOverride w:val="1"/>
-    </w:lvlOverride>
-    <w:lvlOverride w:ilvl="2">
-      <w:startOverride w:val="1"/>
-    </w:lvlOverride>
-    <w:lvlOverride w:ilvl="3">
-      <w:startOverride w:val="1"/>
-    </w:lvlOverride>
-    <w:lvlOverride w:ilvl="4">
-      <w:startOverride w:val="1"/>
-    </w:lvlOverride>
-    <w:lvlOverride w:ilvl="5">
-      <w:startOverride w:val="1"/>
-    </w:lvlOverride>
-    <w:lvlOverride w:ilvl="6">
-      <w:startOverride w:val="1"/>
-    </w:lvlOverride>
-    <w:lvlOverride w:ilvl="7">
-      <w:startOverride w:val="1"/>
-    </w:lvlOverride>
-    <w:lvlOverride w:ilvl="8">
-      <w:startOverride w:val="1"/>
-    </w:lvlOverride>
+    <w:abstractNumId w:val="991"/>
   </w:num>
   <w:num w:numId="1005">
     <w:abstractNumId w:val="991"/>

</xml_diff>